<commit_message>
v4.2: Auftragsbogen A4 neutral als «Selbsteinschaetzung» (E18)
Titel, Satz, Spalte «Fremd» statt «LP» und die zwei Schreibfelder nennen
weder Lehrperson noch KN noch Note; Kriterien und Stufen unveraendert.
Begleiter beschreibt die Rueckmeldung weiter als Vorschlag. Gold-Exporte
erneuert.

Co-Authored-By: Claude Fable 5.1 <noreply@anthropic.com>
</commit_message>
<xml_diff>
--- a/docs/upgrade-v4.2/gold/auftragsbogen.docx
+++ b/docs/upgrade-v4.2/gold/auftragsbogen.docx
@@ -2312,7 +2312,7 @@
           <w:sz w:val="26"/>
           <w:szCs w:val="26"/>
         </w:rPr>
-        <w:t xml:space="preserve">Rückmeldung</w:t>
+        <w:t xml:space="preserve">Selbsteinschätzung</w:t>
       </w:r>
     </w:p>
     <w:p>
@@ -2324,7 +2324,7 @@
           <w:sz w:val="18"/>
           <w:szCs w:val="18"/>
         </w:rPr>
-        <w:t xml:space="preserve">Kreuzen Sie vor der Abgabe je Kriterium Ihre Stufe an (Spalte «Selbst»). Die Lehrperson gibt Ihnen Rückmeldung auf derselben Skala (Spalte «LP»). Es sind die Kriterien des KN; der Auftrag zählt nicht für die Note.</w:t>
+        <w:t xml:space="preserve">Schätzen Sie Ihre Arbeit selbst ein: Kreuzen Sie je Kriterium die Stufe an, die zutrifft (Spalte «Selbst»). Die Spalte «Fremd» ist frei für eine Rückmeldung von aussen.</w:t>
       </w:r>
     </w:p>
     <w:tbl>
@@ -2484,7 +2484,7 @@
                 <w:sz w:val="14"/>
                 <w:szCs w:val="14"/>
               </w:rPr>
-              <w:t xml:space="preserve">LP</w:t>
+              <w:t xml:space="preserve">FREMD</w:t>
             </w:r>
           </w:p>
         </w:tc>
@@ -4848,7 +4848,7 @@
           <w:sz w:val="14"/>
           <w:szCs w:val="14"/>
         </w:rPr>
-        <w:t xml:space="preserve">BIS ZUM KN VERBESSERE ICH …</w:t>
+        <w:t xml:space="preserve">DAS VERBESSERE ICH …</w:t>
       </w:r>
     </w:p>
     <w:p>
@@ -4898,7 +4898,7 @@
           <w:sz w:val="14"/>
           <w:szCs w:val="14"/>
         </w:rPr>
-        <w:t xml:space="preserve">RÜCKMELDUNG MEINER PARTNERIN / MEINES PARTNERS</w:t>
+        <w:t xml:space="preserve">RÜCKMELDUNG, DIE ICH ERHALTEN HABE</w:t>
       </w:r>
     </w:p>
     <w:p>

</xml_diff>